<commit_message>
felaket senaryosu simule edildi testler yapildi rapora gorseller eklendi
</commit_message>
<xml_diff>
--- a/RAPOR.docx
+++ b/RAPOR.docx
@@ -20,7 +20,7 @@
           <w:noProof/>
         </w:rPr>
         <w:drawing>
-          <wp:inline distT="0" distB="0" distL="0" distR="0" wp14:anchorId="537ECBD4" wp14:editId="7B39F2A6">
+          <wp:inline distT="0" distB="0" distL="0" distR="0" wp14:anchorId="537ECBD4" wp14:editId="145BF57D">
             <wp:extent cx="2268071" cy="2268071"/>
             <wp:effectExtent l="0" t="0" r="5715" b="5715"/>
             <wp:docPr id="756522366" name="Picture 1"/>
@@ -635,6 +635,680 @@
         </w:rPr>
       </w:pPr>
     </w:p>
+    <w:p>
+      <w:pPr>
+        <w:rPr>
+          <w:lang w:val="tr-TR"/>
+        </w:rPr>
+      </w:pPr>
+      <w:r>
+        <w:rPr>
+          <w:lang w:val="tr-TR"/>
+        </w:rPr>
+        <w:t xml:space="preserve">Yedekleme süreçlerinin otomasyonu için </w:t>
+      </w:r>
+      <w:proofErr w:type="spellStart"/>
+      <w:r>
+        <w:rPr>
+          <w:lang w:val="tr-TR"/>
+        </w:rPr>
+        <w:t>macOS</w:t>
+      </w:r>
+      <w:proofErr w:type="spellEnd"/>
+      <w:r>
+        <w:rPr>
+          <w:lang w:val="tr-TR"/>
+        </w:rPr>
+        <w:t xml:space="preserve"> işletim sisteminin zamanlama aracı olan </w:t>
+      </w:r>
+      <w:proofErr w:type="spellStart"/>
+      <w:r>
+        <w:rPr>
+          <w:lang w:val="tr-TR"/>
+        </w:rPr>
+        <w:t>crontab</w:t>
+      </w:r>
+      <w:proofErr w:type="spellEnd"/>
+      <w:r>
+        <w:rPr>
+          <w:lang w:val="tr-TR"/>
+        </w:rPr>
+        <w:t xml:space="preserve"> kullanılmıştır. Aşağıdaki komutlar sayesinde her </w:t>
+      </w:r>
+      <w:proofErr w:type="gramStart"/>
+      <w:r>
+        <w:rPr>
+          <w:lang w:val="tr-TR"/>
+        </w:rPr>
+        <w:t>Pazar</w:t>
+      </w:r>
+      <w:proofErr w:type="gramEnd"/>
+      <w:r>
+        <w:rPr>
+          <w:lang w:val="tr-TR"/>
+        </w:rPr>
+        <w:t xml:space="preserve"> günü tam yedek alınması ve her gece artımlı yedek alınması sağlanmıştır.</w:t>
+      </w:r>
+    </w:p>
+    <w:p>
+      <w:pPr>
+        <w:rPr>
+          <w:lang w:val="tr-TR"/>
+        </w:rPr>
+      </w:pPr>
+    </w:p>
+    <w:p>
+      <w:pPr>
+        <w:rPr>
+          <w:rFonts w:ascii="FiraCode Nerd Font" w:hAnsi="FiraCode Nerd Font" w:cs="FiraCode Nerd Font"/>
+          <w:sz w:val="22"/>
+          <w:szCs w:val="22"/>
+          <w:lang w:val="tr-TR"/>
+        </w:rPr>
+      </w:pPr>
+      <w:r>
+        <w:rPr>
+          <w:rFonts w:ascii="FiraCode Nerd Font" w:hAnsi="FiraCode Nerd Font" w:cs="FiraCode Nerd Font"/>
+          <w:sz w:val="22"/>
+          <w:szCs w:val="22"/>
+          <w:lang w:val="tr-TR"/>
+        </w:rPr>
+        <w:t># 1. Her Pazar gece saat 02:00'da Tam Yedek al</w:t>
+      </w:r>
+    </w:p>
+    <w:p>
+      <w:pPr>
+        <w:rPr>
+          <w:rFonts w:ascii="FiraCode Nerd Font" w:hAnsi="FiraCode Nerd Font" w:cs="FiraCode Nerd Font"/>
+          <w:sz w:val="22"/>
+          <w:szCs w:val="22"/>
+          <w:lang w:val="tr-TR"/>
+        </w:rPr>
+      </w:pPr>
+      <w:r>
+        <w:rPr>
+          <w:rFonts w:ascii="FiraCode Nerd Font" w:hAnsi="FiraCode Nerd Font" w:cs="FiraCode Nerd Font"/>
+          <w:sz w:val="22"/>
+          <w:szCs w:val="22"/>
+          <w:lang w:val="tr-TR"/>
+        </w:rPr>
+        <w:t xml:space="preserve">0 2 * * 0 </w:t>
+      </w:r>
+      <w:proofErr w:type="spellStart"/>
+      <w:r>
+        <w:rPr>
+          <w:rFonts w:ascii="FiraCode Nerd Font" w:hAnsi="FiraCode Nerd Font" w:cs="FiraCode Nerd Font"/>
+          <w:sz w:val="22"/>
+          <w:szCs w:val="22"/>
+          <w:lang w:val="tr-TR"/>
+        </w:rPr>
+        <w:t>pgbackrest</w:t>
+      </w:r>
+      <w:proofErr w:type="spellEnd"/>
+      <w:r>
+        <w:rPr>
+          <w:rFonts w:ascii="FiraCode Nerd Font" w:hAnsi="FiraCode Nerd Font" w:cs="FiraCode Nerd Font"/>
+          <w:sz w:val="22"/>
+          <w:szCs w:val="22"/>
+          <w:lang w:val="tr-TR"/>
+        </w:rPr>
+        <w:t xml:space="preserve"> --</w:t>
+      </w:r>
+      <w:proofErr w:type="spellStart"/>
+      <w:r>
+        <w:rPr>
+          <w:rFonts w:ascii="FiraCode Nerd Font" w:hAnsi="FiraCode Nerd Font" w:cs="FiraCode Nerd Font"/>
+          <w:sz w:val="22"/>
+          <w:szCs w:val="22"/>
+          <w:lang w:val="tr-TR"/>
+        </w:rPr>
+        <w:t>stanza</w:t>
+      </w:r>
+      <w:proofErr w:type="spellEnd"/>
+      <w:r>
+        <w:rPr>
+          <w:rFonts w:ascii="FiraCode Nerd Font" w:hAnsi="FiraCode Nerd Font" w:cs="FiraCode Nerd Font"/>
+          <w:sz w:val="22"/>
+          <w:szCs w:val="22"/>
+          <w:lang w:val="tr-TR"/>
+        </w:rPr>
+        <w:t>=scenario-1 --</w:t>
+      </w:r>
+      <w:proofErr w:type="spellStart"/>
+      <w:r>
+        <w:rPr>
+          <w:rFonts w:ascii="FiraCode Nerd Font" w:hAnsi="FiraCode Nerd Font" w:cs="FiraCode Nerd Font"/>
+          <w:sz w:val="22"/>
+          <w:szCs w:val="22"/>
+          <w:lang w:val="tr-TR"/>
+        </w:rPr>
+        <w:t>type</w:t>
+      </w:r>
+      <w:proofErr w:type="spellEnd"/>
+      <w:r>
+        <w:rPr>
+          <w:rFonts w:ascii="FiraCode Nerd Font" w:hAnsi="FiraCode Nerd Font" w:cs="FiraCode Nerd Font"/>
+          <w:sz w:val="22"/>
+          <w:szCs w:val="22"/>
+          <w:lang w:val="tr-TR"/>
+        </w:rPr>
+        <w:t>=</w:t>
+      </w:r>
+      <w:proofErr w:type="spellStart"/>
+      <w:r>
+        <w:rPr>
+          <w:rFonts w:ascii="FiraCode Nerd Font" w:hAnsi="FiraCode Nerd Font" w:cs="FiraCode Nerd Font"/>
+          <w:sz w:val="22"/>
+          <w:szCs w:val="22"/>
+          <w:lang w:val="tr-TR"/>
+        </w:rPr>
+        <w:t>full</w:t>
+      </w:r>
+      <w:proofErr w:type="spellEnd"/>
+      <w:r>
+        <w:rPr>
+          <w:rFonts w:ascii="FiraCode Nerd Font" w:hAnsi="FiraCode Nerd Font" w:cs="FiraCode Nerd Font"/>
+          <w:sz w:val="22"/>
+          <w:szCs w:val="22"/>
+          <w:lang w:val="tr-TR"/>
+        </w:rPr>
+        <w:t xml:space="preserve"> </w:t>
+      </w:r>
+      <w:proofErr w:type="spellStart"/>
+      <w:r>
+        <w:rPr>
+          <w:rFonts w:ascii="FiraCode Nerd Font" w:hAnsi="FiraCode Nerd Font" w:cs="FiraCode Nerd Font"/>
+          <w:sz w:val="22"/>
+          <w:szCs w:val="22"/>
+          <w:lang w:val="tr-TR"/>
+        </w:rPr>
+        <w:t>backup</w:t>
+      </w:r>
+      <w:proofErr w:type="spellEnd"/>
+    </w:p>
+    <w:p>
+      <w:pPr>
+        <w:rPr>
+          <w:rFonts w:ascii="FiraCode Nerd Font" w:hAnsi="FiraCode Nerd Font" w:cs="FiraCode Nerd Font"/>
+          <w:sz w:val="22"/>
+          <w:szCs w:val="22"/>
+          <w:lang w:val="tr-TR"/>
+        </w:rPr>
+      </w:pPr>
+    </w:p>
+    <w:p>
+      <w:pPr>
+        <w:rPr>
+          <w:rFonts w:ascii="FiraCode Nerd Font" w:hAnsi="FiraCode Nerd Font" w:cs="FiraCode Nerd Font"/>
+          <w:sz w:val="22"/>
+          <w:szCs w:val="22"/>
+          <w:lang w:val="tr-TR"/>
+        </w:rPr>
+      </w:pPr>
+      <w:r>
+        <w:rPr>
+          <w:rFonts w:ascii="FiraCode Nerd Font" w:hAnsi="FiraCode Nerd Font" w:cs="FiraCode Nerd Font"/>
+          <w:sz w:val="22"/>
+          <w:szCs w:val="22"/>
+          <w:lang w:val="tr-TR"/>
+        </w:rPr>
+        <w:t># 2. Haftanın geri kalan günlerinde (Pazartesi-Cumartesi) gece 02:00'da Artı</w:t>
+      </w:r>
+      <w:r>
+        <w:rPr>
+          <w:rFonts w:ascii="FiraCode Nerd Font" w:hAnsi="FiraCode Nerd Font" w:cs="FiraCode Nerd Font"/>
+          <w:sz w:val="22"/>
+          <w:szCs w:val="22"/>
+          <w:lang w:val="tr-TR"/>
+        </w:rPr>
+        <w:t>mlı</w:t>
+      </w:r>
+      <w:r>
+        <w:rPr>
+          <w:rFonts w:ascii="FiraCode Nerd Font" w:hAnsi="FiraCode Nerd Font" w:cs="FiraCode Nerd Font"/>
+          <w:sz w:val="22"/>
+          <w:szCs w:val="22"/>
+          <w:lang w:val="tr-TR"/>
+        </w:rPr>
+        <w:t xml:space="preserve"> Yedek (</w:t>
+      </w:r>
+      <w:proofErr w:type="spellStart"/>
+      <w:r>
+        <w:rPr>
+          <w:rFonts w:ascii="FiraCode Nerd Font" w:hAnsi="FiraCode Nerd Font" w:cs="FiraCode Nerd Font"/>
+          <w:sz w:val="22"/>
+          <w:szCs w:val="22"/>
+          <w:lang w:val="tr-TR"/>
+        </w:rPr>
+        <w:t>Incr</w:t>
+      </w:r>
+      <w:proofErr w:type="spellEnd"/>
+      <w:r>
+        <w:rPr>
+          <w:rFonts w:ascii="FiraCode Nerd Font" w:hAnsi="FiraCode Nerd Font" w:cs="FiraCode Nerd Font"/>
+          <w:sz w:val="22"/>
+          <w:szCs w:val="22"/>
+          <w:lang w:val="tr-TR"/>
+        </w:rPr>
+        <w:t>) al</w:t>
+      </w:r>
+    </w:p>
+    <w:p>
+      <w:pPr>
+        <w:pStyle w:val="Paragraphedeliste"/>
+        <w:numPr>
+          <w:ilvl w:val="0"/>
+          <w:numId w:val="13"/>
+        </w:numPr>
+        <w:rPr>
+          <w:rFonts w:ascii="FiraCode Nerd Font" w:hAnsi="FiraCode Nerd Font" w:cs="FiraCode Nerd Font"/>
+          <w:sz w:val="22"/>
+          <w:szCs w:val="22"/>
+          <w:lang w:val="tr-TR"/>
+        </w:rPr>
+      </w:pPr>
+      <w:r>
+        <w:rPr>
+          <w:rFonts w:ascii="FiraCode Nerd Font" w:hAnsi="FiraCode Nerd Font" w:cs="FiraCode Nerd Font"/>
+          <w:sz w:val="22"/>
+          <w:szCs w:val="22"/>
+          <w:lang w:val="tr-TR"/>
+        </w:rPr>
+        <w:t xml:space="preserve">2 * * 1-6 </w:t>
+      </w:r>
+      <w:proofErr w:type="spellStart"/>
+      <w:r>
+        <w:rPr>
+          <w:rFonts w:ascii="FiraCode Nerd Font" w:hAnsi="FiraCode Nerd Font" w:cs="FiraCode Nerd Font"/>
+          <w:sz w:val="22"/>
+          <w:szCs w:val="22"/>
+          <w:lang w:val="tr-TR"/>
+        </w:rPr>
+        <w:t>pgbackrest</w:t>
+      </w:r>
+      <w:proofErr w:type="spellEnd"/>
+      <w:r>
+        <w:rPr>
+          <w:rFonts w:ascii="FiraCode Nerd Font" w:hAnsi="FiraCode Nerd Font" w:cs="FiraCode Nerd Font"/>
+          <w:sz w:val="22"/>
+          <w:szCs w:val="22"/>
+          <w:lang w:val="tr-TR"/>
+        </w:rPr>
+        <w:t xml:space="preserve"> --</w:t>
+      </w:r>
+      <w:proofErr w:type="spellStart"/>
+      <w:r>
+        <w:rPr>
+          <w:rFonts w:ascii="FiraCode Nerd Font" w:hAnsi="FiraCode Nerd Font" w:cs="FiraCode Nerd Font"/>
+          <w:sz w:val="22"/>
+          <w:szCs w:val="22"/>
+          <w:lang w:val="tr-TR"/>
+        </w:rPr>
+        <w:t>stanza</w:t>
+      </w:r>
+      <w:proofErr w:type="spellEnd"/>
+      <w:r>
+        <w:rPr>
+          <w:rFonts w:ascii="FiraCode Nerd Font" w:hAnsi="FiraCode Nerd Font" w:cs="FiraCode Nerd Font"/>
+          <w:sz w:val="22"/>
+          <w:szCs w:val="22"/>
+          <w:lang w:val="tr-TR"/>
+        </w:rPr>
+        <w:t>=scenario-1 --</w:t>
+      </w:r>
+      <w:proofErr w:type="spellStart"/>
+      <w:r>
+        <w:rPr>
+          <w:rFonts w:ascii="FiraCode Nerd Font" w:hAnsi="FiraCode Nerd Font" w:cs="FiraCode Nerd Font"/>
+          <w:sz w:val="22"/>
+          <w:szCs w:val="22"/>
+          <w:lang w:val="tr-TR"/>
+        </w:rPr>
+        <w:t>type</w:t>
+      </w:r>
+      <w:proofErr w:type="spellEnd"/>
+      <w:r>
+        <w:rPr>
+          <w:rFonts w:ascii="FiraCode Nerd Font" w:hAnsi="FiraCode Nerd Font" w:cs="FiraCode Nerd Font"/>
+          <w:sz w:val="22"/>
+          <w:szCs w:val="22"/>
+          <w:lang w:val="tr-TR"/>
+        </w:rPr>
+        <w:t>=</w:t>
+      </w:r>
+      <w:proofErr w:type="spellStart"/>
+      <w:r>
+        <w:rPr>
+          <w:rFonts w:ascii="FiraCode Nerd Font" w:hAnsi="FiraCode Nerd Font" w:cs="FiraCode Nerd Font"/>
+          <w:sz w:val="22"/>
+          <w:szCs w:val="22"/>
+          <w:lang w:val="tr-TR"/>
+        </w:rPr>
+        <w:t>incr</w:t>
+      </w:r>
+      <w:proofErr w:type="spellEnd"/>
+      <w:r>
+        <w:rPr>
+          <w:rFonts w:ascii="FiraCode Nerd Font" w:hAnsi="FiraCode Nerd Font" w:cs="FiraCode Nerd Font"/>
+          <w:sz w:val="22"/>
+          <w:szCs w:val="22"/>
+          <w:lang w:val="tr-TR"/>
+        </w:rPr>
+        <w:t xml:space="preserve"> </w:t>
+      </w:r>
+      <w:proofErr w:type="spellStart"/>
+      <w:r>
+        <w:rPr>
+          <w:rFonts w:ascii="FiraCode Nerd Font" w:hAnsi="FiraCode Nerd Font" w:cs="FiraCode Nerd Font"/>
+          <w:sz w:val="22"/>
+          <w:szCs w:val="22"/>
+          <w:lang w:val="tr-TR"/>
+        </w:rPr>
+        <w:t>backup</w:t>
+      </w:r>
+      <w:proofErr w:type="spellEnd"/>
+    </w:p>
+    <w:p>
+      <w:pPr>
+        <w:rPr>
+          <w:rFonts w:ascii="FiraCode Nerd Font" w:hAnsi="FiraCode Nerd Font" w:cs="FiraCode Nerd Font"/>
+          <w:sz w:val="22"/>
+          <w:szCs w:val="22"/>
+          <w:lang w:val="tr-TR"/>
+        </w:rPr>
+      </w:pPr>
+    </w:p>
+    <w:p>
+      <w:pPr>
+        <w:pStyle w:val="Titre2"/>
+        <w:numPr>
+          <w:ilvl w:val="0"/>
+          <w:numId w:val="0"/>
+        </w:numPr>
+        <w:spacing w:before="240"/>
+        <w:ind w:left="567"/>
+        <w:rPr>
+          <w:lang w:val="tr-TR"/>
+        </w:rPr>
+      </w:pPr>
+      <w:r>
+        <w:rPr>
+          <w:lang w:val="tr-TR"/>
+        </w:rPr>
+        <w:t>3.3 Felaketten Kurtarma Senaryoları</w:t>
+      </w:r>
+    </w:p>
+    <w:p>
+      <w:pPr>
+        <w:spacing w:before="240"/>
+        <w:rPr>
+          <w:lang w:val="tr-TR"/>
+        </w:rPr>
+      </w:pPr>
+      <w:r>
+        <w:rPr>
+          <w:lang w:val="tr-TR"/>
+        </w:rPr>
+        <w:t>Hazırlanan altyapı ve stratejiler ile bir felaket simüle edilmiş ve veriler bu felaketten kurtarılmıştır. Bu bölümde bu felaketin nasıl simüle edildiğine ve senaryonun çıktıları incelenmektedir.</w:t>
+      </w:r>
+    </w:p>
+    <w:p>
+      <w:pPr>
+        <w:spacing w:before="240"/>
+        <w:rPr>
+          <w:lang w:val="tr-TR"/>
+        </w:rPr>
+      </w:pPr>
+      <w:r>
+        <w:rPr>
+          <w:lang w:val="tr-TR"/>
+        </w:rPr>
+        <w:t>Felaket senaryosundan önce aşağıdaki komut aracılığıyla örnek veri tabanının bir yedeği alınmıştır.</w:t>
+      </w:r>
+    </w:p>
+    <w:p>
+      <w:pPr>
+        <w:spacing w:before="240"/>
+        <w:rPr>
+          <w:lang w:val="tr-TR"/>
+        </w:rPr>
+      </w:pPr>
+      <w:r>
+        <w:rPr>
+          <w:lang w:val="tr-TR"/>
+        </w:rPr>
+        <w:drawing>
+          <wp:inline distT="0" distB="0" distL="0" distR="0" wp14:anchorId="306F6DA2" wp14:editId="054E5BC8">
+            <wp:extent cx="5971540" cy="1852295"/>
+            <wp:effectExtent l="0" t="0" r="0" b="1905"/>
+            <wp:docPr id="1392225075" name="Image 1"/>
+            <wp:cNvGraphicFramePr>
+              <a:graphicFrameLocks xmlns:a="http://schemas.openxmlformats.org/drawingml/2006/main" noChangeAspect="1"/>
+            </wp:cNvGraphicFramePr>
+            <a:graphic xmlns:a="http://schemas.openxmlformats.org/drawingml/2006/main">
+              <a:graphicData uri="http://schemas.openxmlformats.org/drawingml/2006/picture">
+                <pic:pic xmlns:pic="http://schemas.openxmlformats.org/drawingml/2006/picture">
+                  <pic:nvPicPr>
+                    <pic:cNvPr id="1392225075" name=""/>
+                    <pic:cNvPicPr/>
+                  </pic:nvPicPr>
+                  <pic:blipFill>
+                    <a:blip r:embed="rId7"/>
+                    <a:stretch>
+                      <a:fillRect/>
+                    </a:stretch>
+                  </pic:blipFill>
+                  <pic:spPr>
+                    <a:xfrm>
+                      <a:off x="0" y="0"/>
+                      <a:ext cx="5971540" cy="1852295"/>
+                    </a:xfrm>
+                    <a:prstGeom prst="rect">
+                      <a:avLst/>
+                    </a:prstGeom>
+                  </pic:spPr>
+                </pic:pic>
+              </a:graphicData>
+            </a:graphic>
+          </wp:inline>
+        </w:drawing>
+      </w:r>
+    </w:p>
+    <w:p>
+      <w:pPr>
+        <w:spacing w:before="240"/>
+        <w:rPr>
+          <w:lang w:val="en-US"/>
+        </w:rPr>
+      </w:pPr>
+      <w:r>
+        <w:rPr>
+          <w:lang w:val="en-US"/>
+        </w:rPr>
+        <w:lastRenderedPageBreak/>
+        <w:drawing>
+          <wp:inline distT="0" distB="0" distL="0" distR="0" wp14:anchorId="53AF69DE" wp14:editId="15193056">
+            <wp:extent cx="5971540" cy="3272790"/>
+            <wp:effectExtent l="0" t="0" r="0" b="3810"/>
+            <wp:docPr id="133909371" name="Image 1" descr="Une image contenant texte, capture d’écran, Police&#10;&#10;Le contenu généré par l’IA peut être incorrect."/>
+            <wp:cNvGraphicFramePr>
+              <a:graphicFrameLocks xmlns:a="http://schemas.openxmlformats.org/drawingml/2006/main" noChangeAspect="1"/>
+            </wp:cNvGraphicFramePr>
+            <a:graphic xmlns:a="http://schemas.openxmlformats.org/drawingml/2006/main">
+              <a:graphicData uri="http://schemas.openxmlformats.org/drawingml/2006/picture">
+                <pic:pic xmlns:pic="http://schemas.openxmlformats.org/drawingml/2006/picture">
+                  <pic:nvPicPr>
+                    <pic:cNvPr id="133909371" name="Image 1" descr="Une image contenant texte, capture d’écran, Police&#10;&#10;Le contenu généré par l’IA peut être incorrect."/>
+                    <pic:cNvPicPr/>
+                  </pic:nvPicPr>
+                  <pic:blipFill>
+                    <a:blip r:embed="rId8"/>
+                    <a:stretch>
+                      <a:fillRect/>
+                    </a:stretch>
+                  </pic:blipFill>
+                  <pic:spPr>
+                    <a:xfrm>
+                      <a:off x="0" y="0"/>
+                      <a:ext cx="5971540" cy="3272790"/>
+                    </a:xfrm>
+                    <a:prstGeom prst="rect">
+                      <a:avLst/>
+                    </a:prstGeom>
+                  </pic:spPr>
+                </pic:pic>
+              </a:graphicData>
+            </a:graphic>
+          </wp:inline>
+        </w:drawing>
+      </w:r>
+    </w:p>
+    <w:p>
+      <w:pPr>
+        <w:spacing w:before="240"/>
+        <w:rPr>
+          <w:lang w:val="en-US"/>
+        </w:rPr>
+      </w:pPr>
+      <w:r>
+        <w:rPr>
+          <w:lang w:val="en-US"/>
+        </w:rPr>
+        <w:drawing>
+          <wp:inline distT="0" distB="0" distL="0" distR="0" wp14:anchorId="52678F47" wp14:editId="2EDAC9A7">
+            <wp:extent cx="5971540" cy="1348740"/>
+            <wp:effectExtent l="0" t="0" r="0" b="0"/>
+            <wp:docPr id="231942686" name="Image 1" descr="Une image contenant texte, capture d’écran, Police, document&#10;&#10;Le contenu généré par l’IA peut être incorrect."/>
+            <wp:cNvGraphicFramePr>
+              <a:graphicFrameLocks xmlns:a="http://schemas.openxmlformats.org/drawingml/2006/main" noChangeAspect="1"/>
+            </wp:cNvGraphicFramePr>
+            <a:graphic xmlns:a="http://schemas.openxmlformats.org/drawingml/2006/main">
+              <a:graphicData uri="http://schemas.openxmlformats.org/drawingml/2006/picture">
+                <pic:pic xmlns:pic="http://schemas.openxmlformats.org/drawingml/2006/picture">
+                  <pic:nvPicPr>
+                    <pic:cNvPr id="231942686" name="Image 1" descr="Une image contenant texte, capture d’écran, Police, document&#10;&#10;Le contenu généré par l’IA peut être incorrect."/>
+                    <pic:cNvPicPr/>
+                  </pic:nvPicPr>
+                  <pic:blipFill>
+                    <a:blip r:embed="rId9"/>
+                    <a:stretch>
+                      <a:fillRect/>
+                    </a:stretch>
+                  </pic:blipFill>
+                  <pic:spPr>
+                    <a:xfrm>
+                      <a:off x="0" y="0"/>
+                      <a:ext cx="5971540" cy="1348740"/>
+                    </a:xfrm>
+                    <a:prstGeom prst="rect">
+                      <a:avLst/>
+                    </a:prstGeom>
+                  </pic:spPr>
+                </pic:pic>
+              </a:graphicData>
+            </a:graphic>
+          </wp:inline>
+        </w:drawing>
+      </w:r>
+    </w:p>
+    <w:p>
+      <w:pPr>
+        <w:spacing w:before="240"/>
+        <w:rPr>
+          <w:lang w:val="en-US"/>
+        </w:rPr>
+      </w:pPr>
+      <w:r>
+        <w:rPr>
+          <w:lang w:val="en-US"/>
+        </w:rPr>
+        <w:lastRenderedPageBreak/>
+        <w:drawing>
+          <wp:inline distT="0" distB="0" distL="0" distR="0" wp14:anchorId="1BE69841" wp14:editId="5C37CBEE">
+            <wp:extent cx="5971540" cy="6381750"/>
+            <wp:effectExtent l="0" t="0" r="0" b="6350"/>
+            <wp:docPr id="870245113" name="Image 1" descr="Une image contenant texte, capture d’écran&#10;&#10;Le contenu généré par l’IA peut être incorrect."/>
+            <wp:cNvGraphicFramePr>
+              <a:graphicFrameLocks xmlns:a="http://schemas.openxmlformats.org/drawingml/2006/main" noChangeAspect="1"/>
+            </wp:cNvGraphicFramePr>
+            <a:graphic xmlns:a="http://schemas.openxmlformats.org/drawingml/2006/main">
+              <a:graphicData uri="http://schemas.openxmlformats.org/drawingml/2006/picture">
+                <pic:pic xmlns:pic="http://schemas.openxmlformats.org/drawingml/2006/picture">
+                  <pic:nvPicPr>
+                    <pic:cNvPr id="870245113" name="Image 1" descr="Une image contenant texte, capture d’écran&#10;&#10;Le contenu généré par l’IA peut être incorrect."/>
+                    <pic:cNvPicPr/>
+                  </pic:nvPicPr>
+                  <pic:blipFill>
+                    <a:blip r:embed="rId10"/>
+                    <a:stretch>
+                      <a:fillRect/>
+                    </a:stretch>
+                  </pic:blipFill>
+                  <pic:spPr>
+                    <a:xfrm>
+                      <a:off x="0" y="0"/>
+                      <a:ext cx="5971540" cy="6381750"/>
+                    </a:xfrm>
+                    <a:prstGeom prst="rect">
+                      <a:avLst/>
+                    </a:prstGeom>
+                  </pic:spPr>
+                </pic:pic>
+              </a:graphicData>
+            </a:graphic>
+          </wp:inline>
+        </w:drawing>
+      </w:r>
+    </w:p>
+    <w:p>
+      <w:pPr>
+        <w:spacing w:before="240"/>
+        <w:rPr>
+          <w:lang w:val="en-US"/>
+        </w:rPr>
+      </w:pPr>
+      <w:r>
+        <w:rPr>
+          <w:lang w:val="en-US"/>
+        </w:rPr>
+        <w:lastRenderedPageBreak/>
+        <w:drawing>
+          <wp:inline distT="0" distB="0" distL="0" distR="0" wp14:anchorId="48554455" wp14:editId="31F69B3A">
+            <wp:extent cx="5971540" cy="2945130"/>
+            <wp:effectExtent l="0" t="0" r="0" b="1270"/>
+            <wp:docPr id="1790803456" name="Image 1"/>
+            <wp:cNvGraphicFramePr>
+              <a:graphicFrameLocks xmlns:a="http://schemas.openxmlformats.org/drawingml/2006/main" noChangeAspect="1"/>
+            </wp:cNvGraphicFramePr>
+            <a:graphic xmlns:a="http://schemas.openxmlformats.org/drawingml/2006/main">
+              <a:graphicData uri="http://schemas.openxmlformats.org/drawingml/2006/picture">
+                <pic:pic xmlns:pic="http://schemas.openxmlformats.org/drawingml/2006/picture">
+                  <pic:nvPicPr>
+                    <pic:cNvPr id="1790803456" name=""/>
+                    <pic:cNvPicPr/>
+                  </pic:nvPicPr>
+                  <pic:blipFill>
+                    <a:blip r:embed="rId11"/>
+                    <a:stretch>
+                      <a:fillRect/>
+                    </a:stretch>
+                  </pic:blipFill>
+                  <pic:spPr>
+                    <a:xfrm>
+                      <a:off x="0" y="0"/>
+                      <a:ext cx="5971540" cy="2945130"/>
+                    </a:xfrm>
+                    <a:prstGeom prst="rect">
+                      <a:avLst/>
+                    </a:prstGeom>
+                  </pic:spPr>
+                </pic:pic>
+              </a:graphicData>
+            </a:graphic>
+          </wp:inline>
+        </w:drawing>
+      </w:r>
+    </w:p>
     <w:sectPr>
       <w:pgSz w:w="12240" w:h="15840"/>
       <w:pgMar w:top="851" w:right="1418" w:bottom="851" w:left="1418" w:header="709" w:footer="709" w:gutter="0"/>
@@ -850,6 +1524,94 @@
     </w:lvl>
   </w:abstractNum>
   <w:abstractNum w:abstractNumId="2" w15:restartNumberingAfterBreak="0">
+    <w:nsid w:val="0BBF40F7"/>
+    <w:multiLevelType w:val="hybridMultilevel"/>
+    <w:tmpl w:val="32E03D20"/>
+    <w:lvl w:ilvl="0" w:tplc="0F660814">
+      <w:numFmt w:val="decimal"/>
+      <w:lvlText w:val="%1"/>
+      <w:lvlJc w:val="left"/>
+      <w:pPr>
+        <w:ind w:left="720" w:hanging="360"/>
+      </w:pPr>
+      <w:rPr>
+        <w:rFonts w:hint="default"/>
+      </w:rPr>
+    </w:lvl>
+    <w:lvl w:ilvl="1" w:tplc="040C0019" w:tentative="1">
+      <w:start w:val="1"/>
+      <w:numFmt w:val="lowerLetter"/>
+      <w:lvlText w:val="%2."/>
+      <w:lvlJc w:val="left"/>
+      <w:pPr>
+        <w:ind w:left="1440" w:hanging="360"/>
+      </w:pPr>
+    </w:lvl>
+    <w:lvl w:ilvl="2" w:tplc="040C001B" w:tentative="1">
+      <w:start w:val="1"/>
+      <w:numFmt w:val="lowerRoman"/>
+      <w:lvlText w:val="%3."/>
+      <w:lvlJc w:val="right"/>
+      <w:pPr>
+        <w:ind w:left="2160" w:hanging="180"/>
+      </w:pPr>
+    </w:lvl>
+    <w:lvl w:ilvl="3" w:tplc="040C000F" w:tentative="1">
+      <w:start w:val="1"/>
+      <w:numFmt w:val="decimal"/>
+      <w:lvlText w:val="%4."/>
+      <w:lvlJc w:val="left"/>
+      <w:pPr>
+        <w:ind w:left="2880" w:hanging="360"/>
+      </w:pPr>
+    </w:lvl>
+    <w:lvl w:ilvl="4" w:tplc="040C0019" w:tentative="1">
+      <w:start w:val="1"/>
+      <w:numFmt w:val="lowerLetter"/>
+      <w:lvlText w:val="%5."/>
+      <w:lvlJc w:val="left"/>
+      <w:pPr>
+        <w:ind w:left="3600" w:hanging="360"/>
+      </w:pPr>
+    </w:lvl>
+    <w:lvl w:ilvl="5" w:tplc="040C001B" w:tentative="1">
+      <w:start w:val="1"/>
+      <w:numFmt w:val="lowerRoman"/>
+      <w:lvlText w:val="%6."/>
+      <w:lvlJc w:val="right"/>
+      <w:pPr>
+        <w:ind w:left="4320" w:hanging="180"/>
+      </w:pPr>
+    </w:lvl>
+    <w:lvl w:ilvl="6" w:tplc="040C000F" w:tentative="1">
+      <w:start w:val="1"/>
+      <w:numFmt w:val="decimal"/>
+      <w:lvlText w:val="%7."/>
+      <w:lvlJc w:val="left"/>
+      <w:pPr>
+        <w:ind w:left="5040" w:hanging="360"/>
+      </w:pPr>
+    </w:lvl>
+    <w:lvl w:ilvl="7" w:tplc="040C0019" w:tentative="1">
+      <w:start w:val="1"/>
+      <w:numFmt w:val="lowerLetter"/>
+      <w:lvlText w:val="%8."/>
+      <w:lvlJc w:val="left"/>
+      <w:pPr>
+        <w:ind w:left="5760" w:hanging="360"/>
+      </w:pPr>
+    </w:lvl>
+    <w:lvl w:ilvl="8" w:tplc="040C001B" w:tentative="1">
+      <w:start w:val="1"/>
+      <w:numFmt w:val="lowerRoman"/>
+      <w:lvlText w:val="%9."/>
+      <w:lvlJc w:val="right"/>
+      <w:pPr>
+        <w:ind w:left="6480" w:hanging="180"/>
+      </w:pPr>
+    </w:lvl>
+  </w:abstractNum>
+  <w:abstractNum w:abstractNumId="3" w15:restartNumberingAfterBreak="0">
     <w:nsid w:val="0FB94EA3"/>
     <w:multiLevelType w:val="hybridMultilevel"/>
     <w:tmpl w:val="19F656F4"/>
@@ -962,7 +1724,7 @@
       </w:rPr>
     </w:lvl>
   </w:abstractNum>
-  <w:abstractNum w:abstractNumId="3" w15:restartNumberingAfterBreak="0">
+  <w:abstractNum w:abstractNumId="4" w15:restartNumberingAfterBreak="0">
     <w:nsid w:val="108B4F27"/>
     <w:multiLevelType w:val="hybridMultilevel"/>
     <w:tmpl w:val="BBBC8B88"/>
@@ -1075,7 +1837,7 @@
       </w:rPr>
     </w:lvl>
   </w:abstractNum>
-  <w:abstractNum w:abstractNumId="4" w15:restartNumberingAfterBreak="0">
+  <w:abstractNum w:abstractNumId="5" w15:restartNumberingAfterBreak="0">
     <w:nsid w:val="35EF4768"/>
     <w:multiLevelType w:val="hybridMultilevel"/>
     <w:tmpl w:val="D0F6E96E"/>
@@ -1164,7 +1926,7 @@
       </w:pPr>
     </w:lvl>
   </w:abstractNum>
-  <w:abstractNum w:abstractNumId="5" w15:restartNumberingAfterBreak="0">
+  <w:abstractNum w:abstractNumId="6" w15:restartNumberingAfterBreak="0">
     <w:nsid w:val="40862335"/>
     <w:multiLevelType w:val="hybridMultilevel"/>
     <w:tmpl w:val="CF2A0B26"/>
@@ -1276,7 +2038,7 @@
       </w:rPr>
     </w:lvl>
   </w:abstractNum>
-  <w:abstractNum w:abstractNumId="6" w15:restartNumberingAfterBreak="0">
+  <w:abstractNum w:abstractNumId="7" w15:restartNumberingAfterBreak="0">
     <w:nsid w:val="44B47B01"/>
     <w:multiLevelType w:val="multilevel"/>
     <w:tmpl w:val="80966170"/>
@@ -1399,7 +2161,7 @@
       </w:rPr>
     </w:lvl>
   </w:abstractNum>
-  <w:abstractNum w:abstractNumId="7" w15:restartNumberingAfterBreak="0">
+  <w:abstractNum w:abstractNumId="8" w15:restartNumberingAfterBreak="0">
     <w:nsid w:val="4D2C584C"/>
     <w:multiLevelType w:val="multilevel"/>
     <w:tmpl w:val="133412DA"/>
@@ -1489,7 +2251,7 @@
       </w:pPr>
     </w:lvl>
   </w:abstractNum>
-  <w:abstractNum w:abstractNumId="8" w15:restartNumberingAfterBreak="0">
+  <w:abstractNum w:abstractNumId="9" w15:restartNumberingAfterBreak="0">
     <w:nsid w:val="51C40AF2"/>
     <w:multiLevelType w:val="hybridMultilevel"/>
     <w:tmpl w:val="BEA8DEB0"/>
@@ -1602,7 +2364,7 @@
       </w:rPr>
     </w:lvl>
   </w:abstractNum>
-  <w:abstractNum w:abstractNumId="9" w15:restartNumberingAfterBreak="0">
+  <w:abstractNum w:abstractNumId="10" w15:restartNumberingAfterBreak="0">
     <w:nsid w:val="57B92515"/>
     <w:multiLevelType w:val="multilevel"/>
     <w:tmpl w:val="0E66C292"/>
@@ -1723,7 +2485,7 @@
       </w:rPr>
     </w:lvl>
   </w:abstractNum>
-  <w:abstractNum w:abstractNumId="10" w15:restartNumberingAfterBreak="0">
+  <w:abstractNum w:abstractNumId="11" w15:restartNumberingAfterBreak="0">
     <w:nsid w:val="62BE64E5"/>
     <w:multiLevelType w:val="hybridMultilevel"/>
     <w:tmpl w:val="F5263ED6"/>
@@ -1836,7 +2598,7 @@
       </w:rPr>
     </w:lvl>
   </w:abstractNum>
-  <w:abstractNum w:abstractNumId="11" w15:restartNumberingAfterBreak="0">
+  <w:abstractNum w:abstractNumId="12" w15:restartNumberingAfterBreak="0">
     <w:nsid w:val="74552130"/>
     <w:multiLevelType w:val="hybridMultilevel"/>
     <w:tmpl w:val="7F209472"/>
@@ -1929,37 +2691,40 @@
     <w:abstractNumId w:val="1"/>
   </w:num>
   <w:num w:numId="2" w16cid:durableId="1816607646">
-    <w:abstractNumId w:val="11"/>
+    <w:abstractNumId w:val="12"/>
   </w:num>
   <w:num w:numId="3" w16cid:durableId="457068896">
-    <w:abstractNumId w:val="3"/>
+    <w:abstractNumId w:val="4"/>
   </w:num>
   <w:num w:numId="4" w16cid:durableId="1245991244">
     <w:abstractNumId w:val="0"/>
   </w:num>
   <w:num w:numId="5" w16cid:durableId="1167094980">
+    <w:abstractNumId w:val="11"/>
+  </w:num>
+  <w:num w:numId="6" w16cid:durableId="859316842">
+    <w:abstractNumId w:val="5"/>
+  </w:num>
+  <w:num w:numId="7" w16cid:durableId="839658637">
     <w:abstractNumId w:val="10"/>
   </w:num>
-  <w:num w:numId="6" w16cid:durableId="859316842">
-    <w:abstractNumId w:val="4"/>
-  </w:num>
-  <w:num w:numId="7" w16cid:durableId="839658637">
+  <w:num w:numId="8" w16cid:durableId="190653116">
     <w:abstractNumId w:val="9"/>
   </w:num>
-  <w:num w:numId="8" w16cid:durableId="190653116">
+  <w:num w:numId="9" w16cid:durableId="710767980">
+    <w:abstractNumId w:val="3"/>
+  </w:num>
+  <w:num w:numId="10" w16cid:durableId="1405834130">
+    <w:abstractNumId w:val="6"/>
+  </w:num>
+  <w:num w:numId="11" w16cid:durableId="1004673215">
+    <w:abstractNumId w:val="7"/>
+  </w:num>
+  <w:num w:numId="12" w16cid:durableId="818154407">
     <w:abstractNumId w:val="8"/>
   </w:num>
-  <w:num w:numId="9" w16cid:durableId="710767980">
+  <w:num w:numId="13" w16cid:durableId="1399860286">
     <w:abstractNumId w:val="2"/>
-  </w:num>
-  <w:num w:numId="10" w16cid:durableId="1405834130">
-    <w:abstractNumId w:val="5"/>
-  </w:num>
-  <w:num w:numId="11" w16cid:durableId="1004673215">
-    <w:abstractNumId w:val="6"/>
-  </w:num>
-  <w:num w:numId="12" w16cid:durableId="818154407">
-    <w:abstractNumId w:val="7"/>
   </w:num>
 </w:numbering>
 </file>

</xml_diff>